<commit_message>
Partially through rewriting the introduction
Committing here before I start messing with the introduction too much; going to incorporate more stuff from the last version of the introduction.

Methods still need some pretty heavy revision, and results need updated numbers.
</commit_message>
<xml_diff>
--- a/manuscript_drafts/bio_con_2/amwo_sdm_appendix_2.5.docx
+++ b/manuscript_drafts/bio_con_2/amwo_sdm_appendix_2.5.docx
@@ -53,6 +53,11 @@
       <w:r>
         <w:rPr>
           <w:rStyle w:val="CommentReference"/>
+          <w:rFonts w:cs="Times New Roman"/>
+          <w:b/>
+          <w:bCs/>
+          <w:sz w:val="24"/>
+          <w:szCs w:val="24"/>
         </w:rPr>
         <w:commentReference w:id="0"/>
       </w:r>
@@ -68,15 +73,7 @@
         <w:t xml:space="preserve">of several potential modeling techniques </w:t>
       </w:r>
       <w:r>
-        <w:t xml:space="preserve">to determine which would be best suited for species distribution modeling using these datasets. We conducted this evaluation (and all subsequent modeling) separately for breeding and migratory seasons, using the full set of covariates available at all spatial scales as predictors. All breeding season pilot models used the same set of woodcock survey data as presence and absence locations, while all migratory season pilot models used the same set of woodcock GPS points as presence locations and </w:t>
-      </w:r>
-      <w:proofErr w:type="gramStart"/>
-      <w:r>
-        <w:t>randomly-generated</w:t>
-      </w:r>
-      <w:proofErr w:type="gramEnd"/>
-      <w:r>
-        <w:t xml:space="preserve"> points as pseudoabsence locations.</w:t>
+        <w:t>to determine which would be best suited for species distribution modeling using these datasets. We conducted this evaluation (and all subsequent modeling) separately for breeding and migratory seasons, using the full set of covariates available at all spatial scales as predictors. All breeding season pilot models used the same set of woodcock survey data as presence and absence locations, while all migratory season pilot models used the same set of woodcock GPS points as presence locations and randomly-generated points as pseudoabsence locations.</w:t>
       </w:r>
     </w:p>
     <w:p>
@@ -90,35 +87,7 @@
         <w:rPr>
           <w:szCs w:val="24"/>
         </w:rPr>
-        <w:t xml:space="preserve">using </w:t>
-      </w:r>
-      <w:proofErr w:type="spellStart"/>
-      <w:r>
-        <w:rPr>
-          <w:szCs w:val="24"/>
-        </w:rPr>
-        <w:t>MaxEnt</w:t>
-      </w:r>
-      <w:proofErr w:type="spellEnd"/>
-      <w:r>
-        <w:rPr>
-          <w:szCs w:val="24"/>
-        </w:rPr>
-        <w:t xml:space="preserve"> (Phillips et al., 2006), random forest classification (</w:t>
-      </w:r>
-      <w:proofErr w:type="spellStart"/>
-      <w:r>
-        <w:rPr>
-          <w:szCs w:val="24"/>
-        </w:rPr>
-        <w:t>Breiman</w:t>
-      </w:r>
-      <w:proofErr w:type="spellEnd"/>
-      <w:r>
-        <w:rPr>
-          <w:szCs w:val="24"/>
-        </w:rPr>
-        <w:t>, 2001), and boosted regression trees (Elith et al., 2008)</w:t>
+        <w:t>using MaxEnt (Phillips et al., 2006), random forest classification (Breiman, 2001), and boosted regression trees (Elith et al., 2008)</w:t>
       </w:r>
       <w:r>
         <w:t>,</w:t>
@@ -129,7 +98,6 @@
         </w:rPr>
         <w:t xml:space="preserve"> fit using the package </w:t>
       </w:r>
-      <w:proofErr w:type="spellStart"/>
       <w:r>
         <w:rPr>
           <w:i/>
@@ -138,7 +106,6 @@
         </w:rPr>
         <w:t>SDMtune</w:t>
       </w:r>
-      <w:proofErr w:type="spellEnd"/>
       <w:r>
         <w:t xml:space="preserve"> for the statistical software R</w:t>
       </w:r>
@@ -149,13 +116,8 @@
         <w:t xml:space="preserve"> (Vignali et al., 2020</w:t>
       </w:r>
       <w:r>
-        <w:t xml:space="preserve">, cite R </w:t>
-      </w:r>
-      <w:proofErr w:type="spellStart"/>
-      <w:r>
-        <w:t>tk</w:t>
-      </w:r>
-      <w:proofErr w:type="spellEnd"/>
+        <w:t>, cite R tk</w:t>
+      </w:r>
       <w:r>
         <w:rPr>
           <w:szCs w:val="24"/>
@@ -194,6 +156,8 @@
       <w:r>
         <w:rPr>
           <w:rStyle w:val="CommentReference"/>
+          <w:sz w:val="24"/>
+          <w:szCs w:val="22"/>
         </w:rPr>
         <w:commentReference w:id="1"/>
       </w:r>
@@ -204,15 +168,7 @@
     <w:p/>
     <w:p>
       <w:r>
-        <w:t xml:space="preserve">Table A1. Caption tk. Talk about where these defaults come from (the source packages, not just </w:t>
-      </w:r>
-      <w:proofErr w:type="spellStart"/>
-      <w:r>
-        <w:t>SDMTune</w:t>
-      </w:r>
-      <w:proofErr w:type="spellEnd"/>
-      <w:r>
-        <w:t>).</w:t>
+        <w:t>Table A1. Caption tk. Talk about where these defaults come from (the source packages, not just SDMTune).</w:t>
       </w:r>
     </w:p>
     <w:tbl>
@@ -929,13 +885,8 @@
         <w:t>Fielding and Bell, 1997</w:t>
       </w:r>
       <w:r>
-        <w:t xml:space="preserve">, cite TSS paper </w:t>
-      </w:r>
-      <w:proofErr w:type="spellStart"/>
-      <w:r>
-        <w:t>tk</w:t>
-      </w:r>
-      <w:proofErr w:type="spellEnd"/>
+        <w:t>, cite TSS paper tk</w:t>
+      </w:r>
       <w:r>
         <w:rPr>
           <w:szCs w:val="24"/>
@@ -1105,8 +1056,14 @@
             <w:pPr>
               <w:pStyle w:val="Table"/>
               <w:jc w:val="both"/>
-            </w:pPr>
-            <w:r>
+              <w:rPr>
+                <w:highlight w:val="yellow"/>
+              </w:rPr>
+            </w:pPr>
+            <w:r>
+              <w:rPr>
+                <w:highlight w:val="yellow"/>
+              </w:rPr>
               <w:t>Breeding season</w:t>
             </w:r>
           </w:p>
@@ -1128,12 +1085,14 @@
               <w:rPr>
                 <w:i/>
                 <w:iCs/>
+                <w:highlight w:val="yellow"/>
               </w:rPr>
             </w:pPr>
             <w:r>
               <w:rPr>
                 <w:i/>
                 <w:iCs/>
+                <w:highlight w:val="yellow"/>
               </w:rPr>
               <w:t>AUC</w:t>
             </w:r>
@@ -1154,14 +1113,19 @@
               <w:pStyle w:val="Table"/>
               <w:jc w:val="both"/>
               <w:rPr>
+                <w:highlight w:val="yellow"/>
                 <w:vertAlign w:val="superscript"/>
               </w:rPr>
             </w:pPr>
             <w:r>
+              <w:rPr>
+                <w:highlight w:val="yellow"/>
+              </w:rPr>
               <w:t>NA</w:t>
             </w:r>
             <w:r>
               <w:rPr>
+                <w:highlight w:val="yellow"/>
                 <w:vertAlign w:val="superscript"/>
               </w:rPr>
               <w:t>1</w:t>
@@ -1182,8 +1146,14 @@
             <w:pPr>
               <w:pStyle w:val="Table"/>
               <w:jc w:val="both"/>
-            </w:pPr>
-            <w:r>
+              <w:rPr>
+                <w:highlight w:val="yellow"/>
+              </w:rPr>
+            </w:pPr>
+            <w:r>
+              <w:rPr>
+                <w:highlight w:val="yellow"/>
+              </w:rPr>
               <w:t>0.787</w:t>
             </w:r>
           </w:p>
@@ -1202,8 +1172,14 @@
             <w:pPr>
               <w:pStyle w:val="Table"/>
               <w:jc w:val="both"/>
-            </w:pPr>
-            <w:r>
+              <w:rPr>
+                <w:highlight w:val="yellow"/>
+              </w:rPr>
+            </w:pPr>
+            <w:r>
+              <w:rPr>
+                <w:highlight w:val="yellow"/>
+              </w:rPr>
               <w:t>0.771</w:t>
             </w:r>
           </w:p>
@@ -1227,6 +1203,9 @@
             <w:pPr>
               <w:pStyle w:val="Table"/>
               <w:jc w:val="both"/>
+              <w:rPr>
+                <w:highlight w:val="yellow"/>
+              </w:rPr>
             </w:pPr>
           </w:p>
         </w:tc>
@@ -1247,12 +1226,14 @@
               <w:rPr>
                 <w:i/>
                 <w:iCs/>
+                <w:highlight w:val="yellow"/>
               </w:rPr>
             </w:pPr>
             <w:r>
               <w:rPr>
                 <w:i/>
                 <w:iCs/>
+                <w:highlight w:val="yellow"/>
               </w:rPr>
               <w:t>TSS</w:t>
             </w:r>
@@ -1273,14 +1254,19 @@
               <w:pStyle w:val="Table"/>
               <w:jc w:val="both"/>
               <w:rPr>
+                <w:highlight w:val="yellow"/>
                 <w:vertAlign w:val="superscript"/>
               </w:rPr>
             </w:pPr>
             <w:r>
+              <w:rPr>
+                <w:highlight w:val="yellow"/>
+              </w:rPr>
               <w:t>NA</w:t>
             </w:r>
             <w:r>
               <w:rPr>
+                <w:highlight w:val="yellow"/>
                 <w:vertAlign w:val="superscript"/>
               </w:rPr>
               <w:t>1</w:t>
@@ -1301,8 +1287,14 @@
             <w:pPr>
               <w:pStyle w:val="Table"/>
               <w:jc w:val="both"/>
-            </w:pPr>
-            <w:r>
+              <w:rPr>
+                <w:highlight w:val="yellow"/>
+              </w:rPr>
+            </w:pPr>
+            <w:r>
+              <w:rPr>
+                <w:highlight w:val="yellow"/>
+              </w:rPr>
               <w:t>0.545</w:t>
             </w:r>
           </w:p>
@@ -1321,8 +1313,14 @@
             <w:pPr>
               <w:pStyle w:val="Table"/>
               <w:jc w:val="both"/>
-            </w:pPr>
-            <w:r>
+              <w:rPr>
+                <w:highlight w:val="yellow"/>
+              </w:rPr>
+            </w:pPr>
+            <w:r>
+              <w:rPr>
+                <w:highlight w:val="yellow"/>
+              </w:rPr>
               <w:t>0.548</w:t>
             </w:r>
           </w:p>
@@ -1346,8 +1344,14 @@
             <w:pPr>
               <w:pStyle w:val="Table"/>
               <w:jc w:val="both"/>
-            </w:pPr>
-            <w:r>
+              <w:rPr>
+                <w:highlight w:val="yellow"/>
+              </w:rPr>
+            </w:pPr>
+            <w:r>
+              <w:rPr>
+                <w:highlight w:val="yellow"/>
+              </w:rPr>
               <w:t>Migratory season</w:t>
             </w:r>
           </w:p>
@@ -1369,12 +1373,14 @@
               <w:rPr>
                 <w:i/>
                 <w:iCs/>
+                <w:highlight w:val="yellow"/>
               </w:rPr>
             </w:pPr>
             <w:r>
               <w:rPr>
                 <w:i/>
                 <w:iCs/>
+                <w:highlight w:val="yellow"/>
               </w:rPr>
               <w:t>AUC</w:t>
             </w:r>
@@ -1394,8 +1400,14 @@
             <w:pPr>
               <w:pStyle w:val="Table"/>
               <w:jc w:val="both"/>
-            </w:pPr>
-            <w:r>
+              <w:rPr>
+                <w:highlight w:val="yellow"/>
+              </w:rPr>
+            </w:pPr>
+            <w:r>
+              <w:rPr>
+                <w:highlight w:val="yellow"/>
+              </w:rPr>
               <w:t>0.617</w:t>
             </w:r>
           </w:p>
@@ -1414,8 +1426,14 @@
             <w:pPr>
               <w:pStyle w:val="Table"/>
               <w:jc w:val="both"/>
-            </w:pPr>
-            <w:r>
+              <w:rPr>
+                <w:highlight w:val="yellow"/>
+              </w:rPr>
+            </w:pPr>
+            <w:r>
+              <w:rPr>
+                <w:highlight w:val="yellow"/>
+              </w:rPr>
               <w:t>0.846</w:t>
             </w:r>
           </w:p>
@@ -1434,8 +1452,14 @@
             <w:pPr>
               <w:pStyle w:val="Table"/>
               <w:jc w:val="both"/>
-            </w:pPr>
-            <w:r>
+              <w:rPr>
+                <w:highlight w:val="yellow"/>
+              </w:rPr>
+            </w:pPr>
+            <w:r>
+              <w:rPr>
+                <w:highlight w:val="yellow"/>
+              </w:rPr>
               <w:t>0.628</w:t>
             </w:r>
           </w:p>
@@ -1458,6 +1482,9 @@
             <w:pPr>
               <w:pStyle w:val="Table"/>
               <w:jc w:val="both"/>
+              <w:rPr>
+                <w:highlight w:val="yellow"/>
+              </w:rPr>
             </w:pPr>
           </w:p>
         </w:tc>
@@ -1477,12 +1504,14 @@
               <w:rPr>
                 <w:i/>
                 <w:iCs/>
+                <w:highlight w:val="yellow"/>
               </w:rPr>
             </w:pPr>
             <w:r>
               <w:rPr>
                 <w:i/>
                 <w:iCs/>
+                <w:highlight w:val="yellow"/>
               </w:rPr>
               <w:t>TSS</w:t>
             </w:r>
@@ -1501,8 +1530,14 @@
             <w:pPr>
               <w:pStyle w:val="Table"/>
               <w:jc w:val="both"/>
-            </w:pPr>
-            <w:r>
+              <w:rPr>
+                <w:highlight w:val="yellow"/>
+              </w:rPr>
+            </w:pPr>
+            <w:r>
+              <w:rPr>
+                <w:highlight w:val="yellow"/>
+              </w:rPr>
               <w:t>0.261</w:t>
             </w:r>
           </w:p>
@@ -1520,8 +1555,14 @@
             <w:pPr>
               <w:pStyle w:val="Table"/>
               <w:jc w:val="both"/>
-            </w:pPr>
-            <w:r>
+              <w:rPr>
+                <w:highlight w:val="yellow"/>
+              </w:rPr>
+            </w:pPr>
+            <w:r>
+              <w:rPr>
+                <w:highlight w:val="yellow"/>
+              </w:rPr>
               <w:t>0.586</w:t>
             </w:r>
           </w:p>
@@ -1539,8 +1580,14 @@
             <w:pPr>
               <w:pStyle w:val="Table"/>
               <w:jc w:val="both"/>
-            </w:pPr>
-            <w:r>
+              <w:rPr>
+                <w:highlight w:val="yellow"/>
+              </w:rPr>
+            </w:pPr>
+            <w:r>
+              <w:rPr>
+                <w:highlight w:val="yellow"/>
+              </w:rPr>
               <w:t>0.286</w:t>
             </w:r>
           </w:p>
@@ -1604,16 +1651,7 @@
           <w:bCs/>
           <w:szCs w:val="24"/>
         </w:rPr>
-        <w:t xml:space="preserve"> </w:t>
-      </w:r>
-      <w:r>
-        <w:rPr>
-          <w:rFonts w:cs="Times New Roman"/>
-          <w:b/>
-          <w:bCs/>
-          <w:szCs w:val="24"/>
-        </w:rPr>
-        <w:t>Design of W-PAST</w:t>
+        <w:t xml:space="preserve"> Design of W-PAST</w:t>
       </w:r>
     </w:p>
     <w:p>
@@ -1702,7 +1740,6 @@
       <w:r>
         <w:t xml:space="preserve"> indicates the value of the weighted pixel value, </w:t>
       </w:r>
-      <w:proofErr w:type="spellStart"/>
       <w:r>
         <w:rPr>
           <w:i/>
@@ -1718,11 +1755,9 @@
         </w:rPr>
         <w:t>m</w:t>
       </w:r>
-      <w:proofErr w:type="spellEnd"/>
       <w:r>
         <w:t xml:space="preserve"> the weight of importance for migratory habitat, </w:t>
       </w:r>
-      <w:proofErr w:type="spellStart"/>
       <w:r>
         <w:rPr>
           <w:i/>
@@ -1738,7 +1773,6 @@
         </w:rPr>
         <w:t>b</w:t>
       </w:r>
-      <w:proofErr w:type="spellEnd"/>
       <w:r>
         <w:t xml:space="preserve"> the breeding season weight, </w:t>
       </w:r>
@@ -2096,11 +2130,9 @@
       <w:r>
         <w:t xml:space="preserve">state-managed </w:t>
       </w:r>
-      <w:proofErr w:type="spellStart"/>
       <w:r>
         <w:t>gamelands</w:t>
       </w:r>
-      <w:proofErr w:type="spellEnd"/>
       <w:r>
         <w:t>.</w:t>
       </w:r>
@@ -2114,79 +2146,7 @@
         <w:t>application</w:t>
       </w:r>
       <w:r>
-        <w:t xml:space="preserve"> that were calculated using the weighted averages of the breeding and migratory season predictive layers: average pixel value, total habitat, % high quality, and % medium quality. Average pixel value was the arithmetic mean of all pixels within a state </w:t>
-      </w:r>
-      <w:proofErr w:type="spellStart"/>
-      <w:r>
-        <w:t>gameland</w:t>
-      </w:r>
-      <w:proofErr w:type="spellEnd"/>
-      <w:r>
-        <w:t xml:space="preserve">, which tended to favor small </w:t>
-      </w:r>
-      <w:proofErr w:type="spellStart"/>
-      <w:r>
-        <w:t>gamelands</w:t>
-      </w:r>
-      <w:proofErr w:type="spellEnd"/>
-      <w:r>
-        <w:t xml:space="preserve"> predominantly composed of woodcock habitat and was intended to demonstrate where a small amount of habitat management could increase local woodcock populations. Total habitat was average pixel value multiplied by the acreage of the </w:t>
-      </w:r>
-      <w:proofErr w:type="spellStart"/>
-      <w:r>
-        <w:t>gameland</w:t>
-      </w:r>
-      <w:proofErr w:type="spellEnd"/>
-      <w:r>
-        <w:t xml:space="preserve">, which favored larger </w:t>
-      </w:r>
-      <w:proofErr w:type="spellStart"/>
-      <w:r>
-        <w:t>gamelands</w:t>
-      </w:r>
-      <w:proofErr w:type="spellEnd"/>
-      <w:r>
-        <w:t xml:space="preserve"> that contained relatively large amounts of woodcock habitat in aggregate by virtue of their size. Total habitat could be used to determine which </w:t>
-      </w:r>
-      <w:proofErr w:type="spellStart"/>
-      <w:r>
-        <w:t>gamelands</w:t>
-      </w:r>
-      <w:proofErr w:type="spellEnd"/>
-      <w:r>
-        <w:t xml:space="preserve"> would provide the most habitat in aggregate if they were managed for woodcock. Percent high quality habitat was the percentage of cells within a </w:t>
-      </w:r>
-      <w:proofErr w:type="spellStart"/>
-      <w:r>
-        <w:t>gameland</w:t>
-      </w:r>
-      <w:proofErr w:type="spellEnd"/>
-      <w:r>
-        <w:t xml:space="preserve"> that had values greater than the 33rd percentile of all pixel values in the state, and percent medium quality was the percentage of cells falling between the 66th and 33rd percentile. These percentile-based metrics allowed users to quantify the proportion of a </w:t>
-      </w:r>
-      <w:proofErr w:type="spellStart"/>
-      <w:r>
-        <w:t>gameland</w:t>
-      </w:r>
-      <w:proofErr w:type="spellEnd"/>
-      <w:r>
-        <w:t xml:space="preserve"> which might be suitable for woodcock management. By multiplying the percent high or medium quality by the </w:t>
-      </w:r>
-      <w:proofErr w:type="spellStart"/>
-      <w:r>
-        <w:t>gameland</w:t>
-      </w:r>
-      <w:proofErr w:type="spellEnd"/>
-      <w:r>
-        <w:t xml:space="preserve"> acreage (also provided in the tool), the user could also derive the acreage in each </w:t>
-      </w:r>
-      <w:proofErr w:type="spellStart"/>
-      <w:r>
-        <w:t>gameland</w:t>
-      </w:r>
-      <w:proofErr w:type="spellEnd"/>
-      <w:r>
-        <w:t xml:space="preserve"> that could be managed for woodcock effectively. Further instructions for using these metrics in management are included in a user manual, publicly available with the SDSS at </w:t>
+        <w:t xml:space="preserve"> that were calculated using the weighted averages of the breeding and migratory season predictive layers: average pixel value, total habitat, % high quality, and % medium quality. Average pixel value was the arithmetic mean of all pixels within a state gameland, which tended to favor small gamelands predominantly composed of woodcock habitat and was intended to demonstrate where a small amount of habitat management could increase local woodcock populations. Total habitat was average pixel value multiplied by the acreage of the gameland, which favored larger gamelands that contained relatively large amounts of woodcock habitat in aggregate by virtue of their size. Total habitat could be used to determine which gamelands would provide the most habitat in aggregate if they were managed for woodcock. Percent high quality habitat was the percentage of cells within a gameland that had values greater than the 33rd percentile of all pixel values in the state, and percent medium quality was the percentage of cells falling between the 66th and 33rd percentile. These percentile-based metrics allowed users to quantify the proportion of a gameland which might be suitable for woodcock management. By multiplying the percent high or medium quality by the gameland acreage (also provided in the tool), the user could also derive the acreage in each gameland that could be managed for woodcock effectively. Further instructions for using these metrics in management are included in a user manual, publicly available with the SDSS at </w:t>
       </w:r>
       <w:hyperlink r:id="rId8" w:history="1">
         <w:r>
@@ -2274,15 +2234,7 @@
         <w:t xml:space="preserve">prioritization </w:t>
       </w:r>
       <w:r>
-        <w:t xml:space="preserve">metrics, which allow the user to compare the suitability of </w:t>
-      </w:r>
-      <w:proofErr w:type="spellStart"/>
-      <w:r>
-        <w:t>gamelands</w:t>
-      </w:r>
-      <w:proofErr w:type="spellEnd"/>
-      <w:r>
-        <w:t xml:space="preserve"> for woodcock management. </w:t>
+        <w:t xml:space="preserve">metrics, which allow the user to compare the suitability of gamelands for woodcock management. </w:t>
       </w:r>
     </w:p>
     <w:p>
@@ -2323,23 +2275,13 @@
           <w:szCs w:val="24"/>
         </w:rPr>
       </w:pPr>
-      <w:proofErr w:type="spellStart"/>
       <w:r>
         <w:rPr>
           <w:rFonts w:cs="Times New Roman"/>
           <w:kern w:val="0"/>
           <w:szCs w:val="24"/>
         </w:rPr>
-        <w:t>Breiman</w:t>
-      </w:r>
-      <w:proofErr w:type="spellEnd"/>
-      <w:r>
-        <w:rPr>
-          <w:rFonts w:cs="Times New Roman"/>
-          <w:kern w:val="0"/>
-          <w:szCs w:val="24"/>
-        </w:rPr>
-        <w:t>, L., 2001. Random forests. Machine learning 45, 5–32.</w:t>
+        <w:t>Breiman, L., 2001. Random forests. Machine learning 45, 5–32.</w:t>
       </w:r>
     </w:p>
     <w:p>
@@ -2353,21 +2295,7 @@
         <w:rPr>
           <w:szCs w:val="24"/>
         </w:rPr>
-        <w:t xml:space="preserve">Chang, W., Cheng, J., Allaire, J.J., Sievert, C., </w:t>
-      </w:r>
-      <w:proofErr w:type="spellStart"/>
-      <w:r>
-        <w:rPr>
-          <w:szCs w:val="24"/>
-        </w:rPr>
-        <w:t>Schloerke</w:t>
-      </w:r>
-      <w:proofErr w:type="spellEnd"/>
-      <w:r>
-        <w:rPr>
-          <w:szCs w:val="24"/>
-        </w:rPr>
-        <w:t>, B., Xie, Y., Allen, J., McPherson, J., Dipert, A., Borges, B., 2022. shiny: Web Application Framework for R.</w:t>
+        <w:t>Chang, W., Cheng, J., Allaire, J.J., Sievert, C., Schloerke, B., Xie, Y., Allen, J., McPherson, J., Dipert, A., Borges, B., 2022. shiny: Web Application Framework for R.</w:t>
       </w:r>
       <w:r>
         <w:rPr>
@@ -2411,25 +2339,7 @@
           <w:kern w:val="0"/>
           <w:szCs w:val="24"/>
         </w:rPr>
-        <w:t xml:space="preserve">Elith, J., </w:t>
-      </w:r>
-      <w:proofErr w:type="spellStart"/>
-      <w:r>
-        <w:rPr>
-          <w:rFonts w:cs="Times New Roman"/>
-          <w:kern w:val="0"/>
-          <w:szCs w:val="24"/>
-        </w:rPr>
-        <w:t>Leathwick</w:t>
-      </w:r>
-      <w:proofErr w:type="spellEnd"/>
-      <w:r>
-        <w:rPr>
-          <w:rFonts w:cs="Times New Roman"/>
-          <w:kern w:val="0"/>
-          <w:szCs w:val="24"/>
-        </w:rPr>
-        <w:t>, J.R., Hastie, T., 2008. A working guide to boosted regression trees. Journal of animal ecology 77, 802–813.</w:t>
+        <w:t>Elith, J., Leathwick, J.R., Hastie, T., 2008. A working guide to boosted regression trees. Journal of animal ecology 77, 802–813.</w:t>
       </w:r>
     </w:p>
     <w:p>
@@ -2465,25 +2375,7 @@
           <w:kern w:val="0"/>
           <w:szCs w:val="24"/>
         </w:rPr>
-        <w:t xml:space="preserve">Phillips, S.J., Anderson, R.P., </w:t>
-      </w:r>
-      <w:proofErr w:type="spellStart"/>
-      <w:r>
-        <w:rPr>
-          <w:rFonts w:cs="Times New Roman"/>
-          <w:kern w:val="0"/>
-          <w:szCs w:val="24"/>
-        </w:rPr>
-        <w:t>Schapire</w:t>
-      </w:r>
-      <w:proofErr w:type="spellEnd"/>
-      <w:r>
-        <w:rPr>
-          <w:rFonts w:cs="Times New Roman"/>
-          <w:kern w:val="0"/>
-          <w:szCs w:val="24"/>
-        </w:rPr>
-        <w:t>, R.E., 2006. Maximum entropy modeling of species geographic distributions. Ecological modelling 190, 231–259.</w:t>
+        <w:t>Phillips, S.J., Anderson, R.P., Schapire, R.E., 2006. Maximum entropy modeling of species geographic distributions. Ecological modelling 190, 231–259.</w:t>
       </w:r>
     </w:p>
     <w:p>

</xml_diff>